<commit_message>
Administratorhandbuch erstellt, noch nicht fertig (fehlende Bilder)
</commit_message>
<xml_diff>
--- a/Dokumentation/Benutzerhandbuch.docx
+++ b/Dokumentation/Benutzerhandbuch.docx
@@ -945,7 +945,7 @@
                                         <w:sz w:val="36"/>
                                         <w:szCs w:val="36"/>
                                       </w:rPr>
-                                      <w:t>ITPT</w:t>
+                                      <w:t>ITP</w:t>
                                     </w:r>
                                   </w:p>
                                 </w:sdtContent>
@@ -1040,7 +1040,7 @@
                                   <w:sz w:val="36"/>
                                   <w:szCs w:val="36"/>
                                 </w:rPr>
-                                <w:t>ITPT</w:t>
+                                <w:t>ITP</w:t>
                               </w:r>
                             </w:p>
                           </w:sdtContent>

</xml_diff>